<commit_message>
refactor: reestrutura diretorios em services/ modularizados e remove segredos/dead-code
</commit_message>
<xml_diff>
--- a/docs/doc-iso/exports/Sentinel_Documentacao_ISO9001.docx
+++ b/docs/doc-iso/exports/Sentinel_Documentacao_ISO9001.docx
@@ -211,7 +211,7 @@
               <w:rPr>
                 <w:sz w:val="16"/>
               </w:rPr>
-              <w:t>https://github.com/lucaslfa84/sentinel-nstech</w:t>
+              <w:t>https://github.com/lucaslfa1/oitiva-di-refatorada</w:t>
             </w:r>
           </w:p>
         </w:tc>
@@ -241,7 +241,7 @@
               <w:rPr>
                 <w:sz w:val="16"/>
               </w:rPr>
-              <w:t>Branch main, commit cd4e0e5</w:t>
+              <w:t>Branch main</w:t>
             </w:r>
           </w:p>
         </w:tc>
@@ -3962,7 +3962,7 @@
               <w:rPr>
                 <w:sz w:val="16"/>
               </w:rPr>
-              <w:t>Sobe backend, sentinel-cortex, dashboard e um servico callapp referenciado.</w:t>
+              <w:t>Sobe backend, sentinel-cortex e dashboard.</w:t>
             </w:r>
           </w:p>
         </w:tc>
@@ -12329,7 +12329,7 @@
               <w:rPr>
                 <w:sz w:val="16"/>
               </w:rPr>
-              <w:t>cd4e0e5</w:t>
+              <w:t>-</w:t>
             </w:r>
           </w:p>
         </w:tc>

</xml_diff>